<commit_message>
commit mattutino, giornata sprint, aggiunto lavoro svolto pol a caasa
</commit_message>
<xml_diff>
--- a/4_Diari/2025.04.02.docx
+++ b/4_Diari/2025.04.02.docx
@@ -133,7 +133,7 @@
                 <w:rFonts w:ascii="Arial" w:hAnsi="Arial" w:cs="Arial"/>
                 <w:noProof/>
               </w:rPr>
-              <w:t>09.04.2025</w:t>
+              <w:t>16.04.2025</w:t>
             </w:r>
             <w:r>
               <w:rPr>
@@ -373,8 +373,6 @@
               </w:rPr>
               <w:t>, risolto</w:t>
             </w:r>
-            <w:bookmarkStart w:id="3" w:name="_GoBack"/>
-            <w:bookmarkEnd w:id="3"/>
           </w:p>
         </w:tc>
       </w:tr>
@@ -927,15 +925,10 @@
               <w:rPr>
                 <w:rFonts w:ascii="Arial" w:hAnsi="Arial" w:cs="Arial"/>
               </w:rPr>
-              <w:t>Andato tutto abbastanza bene, task completate, tranne quelle del profilo che erano come un extra, obiettivo comunicazione raggiunto.</w:t>
+              <w:t>Andato bene, discusso su quello fatto, tutto come il programma a parte il profilo non completo che era un extra.</w:t>
             </w:r>
-          </w:p>
-          <w:p>
-            <w:pPr>
-              <w:rPr>
-                <w:rFonts w:ascii="Arial" w:hAnsi="Arial" w:cs="Arial"/>
-              </w:rPr>
-            </w:pPr>
+            <w:bookmarkStart w:id="3" w:name="_GoBack"/>
+            <w:bookmarkEnd w:id="3"/>
           </w:p>
         </w:tc>
       </w:tr>
@@ -5184,6 +5177,7 @@
     <w:rsid w:val="00283BFA"/>
     <w:rsid w:val="002A3EDE"/>
     <w:rsid w:val="002E249D"/>
+    <w:rsid w:val="002E2788"/>
     <w:rsid w:val="002E357F"/>
     <w:rsid w:val="00304ECD"/>
     <w:rsid w:val="003158F0"/>
@@ -5295,6 +5289,7 @@
     <w:rsid w:val="00F1629B"/>
     <w:rsid w:val="00F227D9"/>
     <w:rsid w:val="00F53A00"/>
+    <w:rsid w:val="00F6635C"/>
     <w:rsid w:val="00F902BF"/>
     <w:rsid w:val="00F93792"/>
     <w:rsid w:val="00FA1CED"/>
@@ -6093,7 +6088,7 @@
 </file>
 
 <file path=customXml/itemProps1.xml><?xml version="1.0" encoding="utf-8"?>
-<ds:datastoreItem xmlns:ds="http://schemas.openxmlformats.org/officeDocument/2006/customXml" ds:itemID="{FE351321-05DE-464E-9037-EC0334348E39}">
+<ds:datastoreItem xmlns:ds="http://schemas.openxmlformats.org/officeDocument/2006/customXml" ds:itemID="{383D02D9-B4AA-4385-BAE7-DED8B09DF71C}">
   <ds:schemaRefs>
     <ds:schemaRef ds:uri="http://schemas.openxmlformats.org/officeDocument/2006/bibliography"/>
   </ds:schemaRefs>

</xml_diff>